<commit_message>
chore(quiniela): ESPN data sync + dev proxy + misc polish
- matches.json/groups.json/teams.json: sync ESPN (fechas CDT, diacriticos)
- migration-match-date-cdt.sql: fix match_date a CDT
- vite.config.js: dev server proxy /api -> Hostinger
- PredictionCard.js, index.css: ajustes mobile
- Guia Quiniela docx/pdf actualizada; lock file removido

Co-Authored-By: Claude <noreply@anthropic.com>
</commit_message>
<xml_diff>
--- a/Guia-Quiniela-Grupo-MB-Mundial-2026.docx
+++ b/Guia-Quiniela-Grupo-MB-Mundial-2026.docx
@@ -17,14 +17,14 @@
         <w:tblLook w:val="04a0" w:noHBand="0" w:noVBand="1" w:firstColumn="1" w:lastRow="0" w:lastColumn="0" w:firstRow="1"/>
       </w:tblPr>
       <w:tblGrid>
-        <w:gridCol w:w="2170"/>
-        <w:gridCol w:w="7236"/>
+        <w:gridCol w:w="2169"/>
+        <w:gridCol w:w="7237"/>
       </w:tblGrid>
       <w:tr>
         <w:trPr/>
         <w:tc>
           <w:tcPr>
-            <w:tcW w:w="2170" w:type="dxa"/>
+            <w:tcW w:w="2169" w:type="dxa"/>
             <w:tcBorders/>
             <w:vAlign w:val="center"/>
           </w:tcPr>
@@ -40,7 +40,7 @@
             <w:r>
               <w:rPr/>
               <w:drawing>
-                <wp:anchor distT="0" distB="0" distL="0" distR="0" simplePos="0" relativeHeight="2" behindDoc="0" locked="0" layoutInCell="0" allowOverlap="1">
+                <wp:anchor distT="0" distB="0" distL="0" distR="0" simplePos="0" relativeHeight="3" behindDoc="0" locked="0" layoutInCell="0" allowOverlap="1">
                   <wp:simplePos x="0" y="0"/>
                   <wp:positionH relativeFrom="column">
                     <wp:align>center</wp:align>
@@ -48,7 +48,7 @@
                   <wp:positionV relativeFrom="paragraph">
                     <wp:posOffset>635</wp:posOffset>
                   </wp:positionV>
-                  <wp:extent cx="1240790" cy="1240790"/>
+                  <wp:extent cx="1240155" cy="1240155"/>
                   <wp:effectExtent l="0" t="0" r="0" b="0"/>
                   <wp:wrapSquare wrapText="largest"/>
                   <wp:docPr id="1" name="Image1"/>
@@ -73,14 +73,12 @@
                         <pic:spPr bwMode="auto">
                           <a:xfrm>
                             <a:off x="0" y="0"/>
-                            <a:ext cx="1240790" cy="1240790"/>
+                            <a:ext cx="1240155" cy="1240155"/>
                           </a:xfrm>
                           <a:prstGeom prst="rect">
                             <a:avLst/>
                           </a:prstGeom>
-                          <a:solidFill>
-                            <a:srgbClr val="f6f9d4"/>
-                          </a:solidFill>
+                          <a:noFill/>
                         </pic:spPr>
                       </pic:pic>
                     </a:graphicData>
@@ -92,7 +90,7 @@
         </w:tc>
         <w:tc>
           <w:tcPr>
-            <w:tcW w:w="7236" w:type="dxa"/>
+            <w:tcW w:w="7237" w:type="dxa"/>
             <w:tcBorders/>
             <w:vAlign w:val="center"/>
           </w:tcPr>
@@ -171,23 +169,7 @@
           <w:color w:val="0B3D0B"/>
           <w:sz w:val="32"/>
         </w:rPr>
-        <w:t>¡Bienvenido</w:t>
-      </w:r>
-      <w:r>
-        <w:rPr>
-          <w:b/>
-          <w:color w:val="0B3D0B"/>
-          <w:sz w:val="32"/>
-        </w:rPr>
-        <w:t>s</w:t>
-      </w:r>
-      <w:r>
-        <w:rPr>
-          <w:b/>
-          <w:color w:val="0B3D0B"/>
-          <w:sz w:val="32"/>
-        </w:rPr>
-        <w:t xml:space="preserve"> a la Quiniela del Mundial!</w:t>
+        <w:t>¡Bienvenidos a la Quiniela del Mundial!</w:t>
       </w:r>
     </w:p>
     <w:p>
@@ -201,27 +183,8 @@
           <w:color w:val="1A1A1A"/>
           <w:sz w:val="21"/>
         </w:rPr>
-        <w:t xml:space="preserve">Participa prediciendo los resultados de los 104 partidos del Mundial FIFA 2026™. Acumula puntos y </w:t>
-      </w:r>
-      <w:r>
-        <w:rPr>
-          <w:color w:val="1A1A1A"/>
-          <w:sz w:val="21"/>
-        </w:rPr>
-        <w:t>si al final del torneo quedas en el top 10 te llevas un premio</w:t>
-      </w:r>
-      <w:r>
-        <w:rPr>
-          <w:color w:val="1A1A1A"/>
-          <w:sz w:val="21"/>
-        </w:rPr>
-        <w:t xml:space="preserve">. </w:t>
-      </w:r>
-      <w:r>
-        <w:rPr>
-          <w:color w:val="1A1A1A"/>
-          <w:sz w:val="21"/>
-        </w:rPr>
+        <w:t xml:space="preserve">Participa prediciendo los resultados de los 104 partidos del Mundial FIFA 2026™. Acumula puntos y si al final del torneo quedas en el top 10 te llevas alguno de los diferentes premios. </w:t>
+        <w:br/>
         <w:t>Solo tienes que registrarte!</w:t>
       </w:r>
     </w:p>
@@ -274,21 +237,7 @@
           <w:color w:val="1A1A1A"/>
           <w:sz w:val="21"/>
         </w:rPr>
-        <w:t xml:space="preserve">Ve a la página de la Quiniela y haz clic en </w:t>
-      </w:r>
-      <w:r>
-        <w:rPr>
-          <w:color w:val="1A1A1A"/>
-          <w:sz w:val="21"/>
-        </w:rPr>
-        <w:t>el boton</w:t>
-      </w:r>
-      <w:r>
-        <w:rPr>
-          <w:color w:val="1A1A1A"/>
-          <w:sz w:val="21"/>
-        </w:rPr>
-        <w:t xml:space="preserve"> de Registrarse.</w:t>
+        <w:t>Ve a la página de la Quiniela y haz clic en el boton de Registrarse.</w:t>
         <w:br/>
         <w:t xml:space="preserve">        </w:t>
       </w:r>
@@ -383,21 +332,7 @@
           <w:color w:val="1A1A1A"/>
           <w:sz w:val="21"/>
         </w:rPr>
-        <w:t xml:space="preserve">Recibirás </w:t>
-      </w:r>
-      <w:r>
-        <w:rPr>
-          <w:color w:val="1A1A1A"/>
-          <w:sz w:val="21"/>
-        </w:rPr>
-        <w:t xml:space="preserve">en pantalla </w:t>
-      </w:r>
-      <w:r>
-        <w:rPr>
-          <w:color w:val="1A1A1A"/>
-          <w:sz w:val="21"/>
-        </w:rPr>
-        <w:t>un código PIN de 6 dígitos. ¡GUÁRDALO!</w:t>
+        <w:t>Recibirás en pantalla un PIN de 6 dígitos. ¡GUÁRDALO!</w:t>
       </w:r>
     </w:p>
     <w:p>
@@ -426,33 +361,13 @@
           <w:color w:val="1A1A1A"/>
           <w:sz w:val="21"/>
         </w:rPr>
-        <w:t xml:space="preserve">Ahora haz clic en Iniciar Sesion y </w:t>
-      </w:r>
-      <w:r>
-        <w:rPr>
-          <w:color w:val="1A1A1A"/>
-          <w:sz w:val="21"/>
-        </w:rPr>
-        <w:t xml:space="preserve">usa tu Email y ese PIN para </w:t>
-      </w:r>
-      <w:r>
-        <w:rPr>
-          <w:color w:val="1A1A1A"/>
-          <w:sz w:val="21"/>
-        </w:rPr>
-        <w:t>entrar</w:t>
-      </w:r>
-      <w:r>
-        <w:rPr>
-          <w:color w:val="1A1A1A"/>
-          <w:sz w:val="21"/>
-        </w:rPr>
-        <w:t>.</w:t>
+        <w:t>Ahora haz clic en Iniciar Sesion y usa tu Email y ese PIN para entrar.</w:t>
       </w:r>
     </w:p>
     <w:p>
       <w:pPr>
         <w:pStyle w:val="Normal"/>
+        <w:jc w:val="center"/>
         <w:rPr/>
       </w:pPr>
       <w:r>
@@ -468,7 +383,44 @@
           <w:color w:val="666666"/>
           <w:sz w:val="20"/>
         </w:rPr>
-        <w:t>Si pierdes tu PIN, contacta al administrador para generarte uno nuevo.</w:t>
+        <w:t xml:space="preserve">Si pierdes tu PIN, contacta a </w:t>
+      </w:r>
+      <w:r>
+        <w:rPr>
+          <w:i/>
+          <w:color w:val="666666"/>
+          <w:sz w:val="20"/>
+        </w:rPr>
+        <w:t>Gilberto Hernandez</w:t>
+      </w:r>
+      <w:r>
+        <w:rPr>
+          <w:i/>
+          <w:color w:val="666666"/>
+          <w:sz w:val="20"/>
+        </w:rPr>
+        <w:t xml:space="preserve"> para generarte uno nuevo. </w:t>
+      </w:r>
+      <w:r>
+        <w:rPr>
+          <w:b/>
+          <w:bCs/>
+          <w:i/>
+          <w:color w:val="666666"/>
+          <w:sz w:val="20"/>
+        </w:rPr>
+        <w:t xml:space="preserve">Solo tienes hasta las 11am del jueves 11 de junio para completar el registro. Despues de esa hora los registros se bloquearan automaticamente. </w:t>
+      </w:r>
+      <w:r>
+        <w:rPr>
+          <w:b/>
+          <w:bCs/>
+          <w:i w:val="false"/>
+          <w:iCs w:val="false"/>
+          <w:color w:val="C0392B"/>
+          <w:sz w:val="20"/>
+        </w:rPr>
+        <w:t>⚠️</w:t>
       </w:r>
     </w:p>
     <w:p>
@@ -574,14 +526,7 @@
           <w:color w:val="1A1A1A"/>
           <w:sz w:val="21"/>
         </w:rPr>
-        <w:t>Pronostica</w:t>
-      </w:r>
-      <w:r>
-        <w:rPr>
-          <w:color w:val="1A1A1A"/>
-          <w:sz w:val="21"/>
-        </w:rPr>
-        <w:t xml:space="preserve"> el marcador exacto (ej: 2-1) para ganar puntos extra.</w:t>
+        <w:t>Pronostica el marcador exacto (ej: 2-1) para ganar puntos extra.</w:t>
       </w:r>
     </w:p>
     <w:p>
@@ -606,12 +551,8 @@
         <w:t xml:space="preserve">3. </w:t>
       </w:r>
       <w:r>
-        <w:rPr>
-          <w:color w:val="1A1A1A"/>
-          <w:sz w:val="21"/>
-        </w:rPr>
         <w:drawing>
-          <wp:anchor distT="0" distB="0" distL="0" distR="0" simplePos="0" relativeHeight="3" behindDoc="0" locked="0" layoutInCell="0" allowOverlap="1">
+          <wp:anchor distT="0" distB="0" distL="0" distR="0" simplePos="0" relativeHeight="2" behindDoc="0" locked="0" layoutInCell="0" allowOverlap="1">
             <wp:simplePos x="0" y="0"/>
             <wp:positionH relativeFrom="column">
               <wp:posOffset>0</wp:posOffset>
@@ -685,23 +626,7 @@
           <w:color w:val="666666"/>
           <w:sz w:val="20"/>
         </w:rPr>
-        <w:t xml:space="preserve">Puedes editar tus predicciones cuantas veces quieras HASTA </w:t>
-      </w:r>
-      <w:r>
-        <w:rPr>
-          <w:i/>
-          <w:color w:val="666666"/>
-          <w:sz w:val="20"/>
-        </w:rPr>
-        <w:t xml:space="preserve">5 MINUTOS ANTES </w:t>
-      </w:r>
-      <w:r>
-        <w:rPr>
-          <w:i/>
-          <w:color w:val="666666"/>
-          <w:sz w:val="20"/>
-        </w:rPr>
-        <w:t>QUE INICIE el partido. Después de eso, se bloquean automáticamente.</w:t>
+        <w:t>Puedes editar tus predicciones cuantas veces quieras HASTA 5 MINUTOS ANTES QUE INICIE el partido. Después de eso, se bloquean automáticamente.</w:t>
       </w:r>
     </w:p>
     <w:p>
@@ -1358,21 +1283,7 @@
           <w:color w:val="1A1A1A"/>
           <w:sz w:val="21"/>
         </w:rPr>
-        <w:t xml:space="preserve">Si hay empate </w:t>
-      </w:r>
-      <w:r>
-        <w:rPr>
-          <w:color w:val="1A1A1A"/>
-          <w:sz w:val="21"/>
-        </w:rPr>
-        <w:t xml:space="preserve">o México pierde </w:t>
-      </w:r>
-      <w:r>
-        <w:rPr>
-          <w:color w:val="1A1A1A"/>
-          <w:sz w:val="21"/>
-        </w:rPr>
-        <w:t>→ 0 pts</w:t>
+        <w:t>Si hay empate o México pierde → 0 pts</w:t>
       </w:r>
     </w:p>
     <w:p>
@@ -1702,14 +1613,7 @@
                 <w:color w:val="1A1A1A"/>
                 <w:sz w:val="20"/>
               </w:rPr>
-              <w:t xml:space="preserve">Playera oficial </w:t>
-            </w:r>
-            <w:r>
-              <w:rPr>
-                <w:color w:val="1A1A1A"/>
-                <w:sz w:val="20"/>
-              </w:rPr>
-              <w:t>del Tri o tu equipo favorito</w:t>
+              <w:t>Playera oficial del Tri o tu equipo favorito</w:t>
             </w:r>
           </w:p>
         </w:tc>
@@ -1734,28 +1638,7 @@
                 <w:color w:val="1A1A1A"/>
                 <w:sz w:val="20"/>
               </w:rPr>
-              <w:t>2</w:t>
-            </w:r>
-            <w:r>
-              <w:rPr>
-                <w:color w:val="1A1A1A"/>
-                <w:sz w:val="20"/>
-              </w:rPr>
-              <w:t xml:space="preserve">° — </w:t>
-            </w:r>
-            <w:r>
-              <w:rPr>
-                <w:color w:val="1A1A1A"/>
-                <w:sz w:val="20"/>
-              </w:rPr>
-              <w:t>3er</w:t>
-            </w:r>
-            <w:r>
-              <w:rPr>
-                <w:color w:val="1A1A1A"/>
-                <w:sz w:val="20"/>
-              </w:rPr>
-              <w:t xml:space="preserve"> Lugar</w:t>
+              <w:t>2° — 3er Lugar</w:t>
             </w:r>
           </w:p>
         </w:tc>
@@ -1803,28 +1686,7 @@
                 <w:color w:val="1A1A1A"/>
                 <w:sz w:val="20"/>
               </w:rPr>
-              <w:t>4</w:t>
-            </w:r>
-            <w:r>
-              <w:rPr>
-                <w:color w:val="1A1A1A"/>
-                <w:sz w:val="20"/>
-              </w:rPr>
-              <w:t xml:space="preserve">° — </w:t>
-            </w:r>
-            <w:r>
-              <w:rPr>
-                <w:color w:val="1A1A1A"/>
-                <w:sz w:val="20"/>
-              </w:rPr>
-              <w:t>5</w:t>
-            </w:r>
-            <w:r>
-              <w:rPr>
-                <w:color w:val="1A1A1A"/>
-                <w:sz w:val="20"/>
-              </w:rPr>
-              <w:t>° Lugar</w:t>
+              <w:t>4° — 5° Lugar</w:t>
             </w:r>
           </w:p>
         </w:tc>
@@ -1873,28 +1735,7 @@
                 <w:color w:val="1A1A1A"/>
                 <w:sz w:val="20"/>
               </w:rPr>
-              <w:t>6</w:t>
-            </w:r>
-            <w:r>
-              <w:rPr>
-                <w:color w:val="1A1A1A"/>
-                <w:sz w:val="20"/>
-              </w:rPr>
-              <w:t xml:space="preserve">° — </w:t>
-            </w:r>
-            <w:r>
-              <w:rPr>
-                <w:color w:val="1A1A1A"/>
-                <w:sz w:val="20"/>
-              </w:rPr>
-              <w:t>10</w:t>
-            </w:r>
-            <w:r>
-              <w:rPr>
-                <w:color w:val="1A1A1A"/>
-                <w:sz w:val="20"/>
-              </w:rPr>
-              <w:t>° Lugar</w:t>
+              <w:t>6° — 10° Lugar</w:t>
             </w:r>
           </w:p>
         </w:tc>
@@ -2086,26 +1927,6 @@
           <w:sz w:val="21"/>
         </w:rPr>
         <w:t>Las predicciones se bloquean automáticamente cuando inicia el partido.</w:t>
-      </w:r>
-    </w:p>
-    <w:p>
-      <w:pPr>
-        <w:pStyle w:val="Normal"/>
-        <w:rPr/>
-      </w:pPr>
-      <w:r>
-        <w:rPr>
-          <w:color w:val="D4AF37"/>
-          <w:sz w:val="21"/>
-        </w:rPr>
-        <w:t xml:space="preserve">  • </w:t>
-      </w:r>
-      <w:r>
-        <w:rPr>
-          <w:color w:val="1A1A1A"/>
-          <w:sz w:val="21"/>
-        </w:rPr>
-        <w:t>El administrador puede bloquear temporalmente todas las predicciones (durante partidos en vivo).</w:t>
       </w:r>
     </w:p>
     <w:p>
@@ -2290,6 +2111,7 @@
         </w:tabs>
         <w:ind w:start="1080" w:hanging="360"/>
       </w:pPr>
+      <w:rPr/>
     </w:lvl>
     <w:lvl w:ilvl="2">
       <w:start w:val="1"/>
@@ -2302,6 +2124,7 @@
         </w:tabs>
         <w:ind w:start="1440" w:hanging="360"/>
       </w:pPr>
+      <w:rPr/>
     </w:lvl>
     <w:lvl w:ilvl="3">
       <w:start w:val="1"/>
@@ -2314,6 +2137,7 @@
         </w:tabs>
         <w:ind w:start="1800" w:hanging="360"/>
       </w:pPr>
+      <w:rPr/>
     </w:lvl>
     <w:lvl w:ilvl="4">
       <w:start w:val="1"/>
@@ -2326,6 +2150,7 @@
         </w:tabs>
         <w:ind w:start="2160" w:hanging="360"/>
       </w:pPr>
+      <w:rPr/>
     </w:lvl>
     <w:lvl w:ilvl="5">
       <w:start w:val="1"/>
@@ -2338,6 +2163,7 @@
         </w:tabs>
         <w:ind w:start="2520" w:hanging="360"/>
       </w:pPr>
+      <w:rPr/>
     </w:lvl>
     <w:lvl w:ilvl="6">
       <w:start w:val="1"/>
@@ -2350,6 +2176,7 @@
         </w:tabs>
         <w:ind w:start="2880" w:hanging="360"/>
       </w:pPr>
+      <w:rPr/>
     </w:lvl>
     <w:lvl w:ilvl="7">
       <w:start w:val="1"/>
@@ -2362,6 +2189,7 @@
         </w:tabs>
         <w:ind w:start="3240" w:hanging="360"/>
       </w:pPr>
+      <w:rPr/>
     </w:lvl>
     <w:lvl w:ilvl="8">
       <w:start w:val="1"/>
@@ -2374,6 +2202,7 @@
         </w:tabs>
         <w:ind w:start="3600" w:hanging="360"/>
       </w:pPr>
+      <w:rPr/>
     </w:lvl>
   </w:abstractNum>
   <w:abstractNum w:abstractNumId="2">
@@ -2403,6 +2232,7 @@
         </w:tabs>
         <w:ind w:start="1080" w:hanging="360"/>
       </w:pPr>
+      <w:rPr/>
     </w:lvl>
     <w:lvl w:ilvl="2">
       <w:start w:val="1"/>
@@ -2415,6 +2245,7 @@
         </w:tabs>
         <w:ind w:start="1440" w:hanging="360"/>
       </w:pPr>
+      <w:rPr/>
     </w:lvl>
     <w:lvl w:ilvl="3">
       <w:start w:val="1"/>
@@ -2427,6 +2258,7 @@
         </w:tabs>
         <w:ind w:start="1800" w:hanging="360"/>
       </w:pPr>
+      <w:rPr/>
     </w:lvl>
     <w:lvl w:ilvl="4">
       <w:start w:val="1"/>
@@ -2439,6 +2271,7 @@
         </w:tabs>
         <w:ind w:start="2160" w:hanging="360"/>
       </w:pPr>
+      <w:rPr/>
     </w:lvl>
     <w:lvl w:ilvl="5">
       <w:start w:val="1"/>
@@ -2451,6 +2284,7 @@
         </w:tabs>
         <w:ind w:start="2520" w:hanging="360"/>
       </w:pPr>
+      <w:rPr/>
     </w:lvl>
     <w:lvl w:ilvl="6">
       <w:start w:val="1"/>
@@ -2463,6 +2297,7 @@
         </w:tabs>
         <w:ind w:start="2880" w:hanging="360"/>
       </w:pPr>
+      <w:rPr/>
     </w:lvl>
     <w:lvl w:ilvl="7">
       <w:start w:val="1"/>
@@ -2475,6 +2310,7 @@
         </w:tabs>
         <w:ind w:start="3240" w:hanging="360"/>
       </w:pPr>
+      <w:rPr/>
     </w:lvl>
     <w:lvl w:ilvl="8">
       <w:start w:val="1"/>
@@ -2487,6 +2323,7 @@
         </w:tabs>
         <w:ind w:start="3600" w:hanging="360"/>
       </w:pPr>
+      <w:rPr/>
     </w:lvl>
   </w:abstractNum>
   <w:abstractNum w:abstractNumId="3">
@@ -2516,6 +2353,7 @@
         </w:tabs>
         <w:ind w:start="1080" w:hanging="360"/>
       </w:pPr>
+      <w:rPr/>
     </w:lvl>
     <w:lvl w:ilvl="2">
       <w:start w:val="1"/>
@@ -2528,6 +2366,7 @@
         </w:tabs>
         <w:ind w:start="1440" w:hanging="360"/>
       </w:pPr>
+      <w:rPr/>
     </w:lvl>
     <w:lvl w:ilvl="3">
       <w:start w:val="1"/>
@@ -2540,6 +2379,7 @@
         </w:tabs>
         <w:ind w:start="1800" w:hanging="360"/>
       </w:pPr>
+      <w:rPr/>
     </w:lvl>
     <w:lvl w:ilvl="4">
       <w:start w:val="1"/>
@@ -2552,6 +2392,7 @@
         </w:tabs>
         <w:ind w:start="2160" w:hanging="360"/>
       </w:pPr>
+      <w:rPr/>
     </w:lvl>
     <w:lvl w:ilvl="5">
       <w:start w:val="1"/>
@@ -2564,6 +2405,7 @@
         </w:tabs>
         <w:ind w:start="2520" w:hanging="360"/>
       </w:pPr>
+      <w:rPr/>
     </w:lvl>
     <w:lvl w:ilvl="6">
       <w:start w:val="1"/>
@@ -2576,6 +2418,7 @@
         </w:tabs>
         <w:ind w:start="2880" w:hanging="360"/>
       </w:pPr>
+      <w:rPr/>
     </w:lvl>
     <w:lvl w:ilvl="7">
       <w:start w:val="1"/>
@@ -2588,6 +2431,7 @@
         </w:tabs>
         <w:ind w:start="3240" w:hanging="360"/>
       </w:pPr>
+      <w:rPr/>
     </w:lvl>
     <w:lvl w:ilvl="8">
       <w:start w:val="1"/>
@@ -2600,6 +2444,7 @@
         </w:tabs>
         <w:ind w:start="3600" w:hanging="360"/>
       </w:pPr>
+      <w:rPr/>
     </w:lvl>
   </w:abstractNum>
   <w:abstractNum w:abstractNumId="4">
@@ -2627,6 +2472,7 @@
         </w:tabs>
         <w:ind w:start="1080" w:hanging="360"/>
       </w:pPr>
+      <w:rPr/>
     </w:lvl>
     <w:lvl w:ilvl="2">
       <w:start w:val="1"/>
@@ -2639,6 +2485,7 @@
         </w:tabs>
         <w:ind w:start="1440" w:hanging="360"/>
       </w:pPr>
+      <w:rPr/>
     </w:lvl>
     <w:lvl w:ilvl="3">
       <w:start w:val="1"/>
@@ -2651,6 +2498,7 @@
         </w:tabs>
         <w:ind w:start="1800" w:hanging="360"/>
       </w:pPr>
+      <w:rPr/>
     </w:lvl>
     <w:lvl w:ilvl="4">
       <w:start w:val="1"/>
@@ -2663,6 +2511,7 @@
         </w:tabs>
         <w:ind w:start="2160" w:hanging="360"/>
       </w:pPr>
+      <w:rPr/>
     </w:lvl>
     <w:lvl w:ilvl="5">
       <w:start w:val="1"/>
@@ -2675,6 +2524,7 @@
         </w:tabs>
         <w:ind w:start="2520" w:hanging="360"/>
       </w:pPr>
+      <w:rPr/>
     </w:lvl>
     <w:lvl w:ilvl="6">
       <w:start w:val="1"/>
@@ -2687,6 +2537,7 @@
         </w:tabs>
         <w:ind w:start="2880" w:hanging="360"/>
       </w:pPr>
+      <w:rPr/>
     </w:lvl>
     <w:lvl w:ilvl="7">
       <w:start w:val="1"/>
@@ -2699,6 +2550,7 @@
         </w:tabs>
         <w:ind w:start="3240" w:hanging="360"/>
       </w:pPr>
+      <w:rPr/>
     </w:lvl>
     <w:lvl w:ilvl="8">
       <w:start w:val="1"/>
@@ -2711,6 +2563,7 @@
         </w:tabs>
         <w:ind w:start="3600" w:hanging="360"/>
       </w:pPr>
+      <w:rPr/>
     </w:lvl>
   </w:abstractNum>
   <w:abstractNum w:abstractNumId="5">
@@ -2738,6 +2591,7 @@
         </w:tabs>
         <w:ind w:start="1080" w:hanging="360"/>
       </w:pPr>
+      <w:rPr/>
     </w:lvl>
     <w:lvl w:ilvl="2">
       <w:start w:val="1"/>
@@ -2750,6 +2604,7 @@
         </w:tabs>
         <w:ind w:start="1440" w:hanging="360"/>
       </w:pPr>
+      <w:rPr/>
     </w:lvl>
     <w:lvl w:ilvl="3">
       <w:start w:val="1"/>
@@ -2762,6 +2617,7 @@
         </w:tabs>
         <w:ind w:start="1800" w:hanging="360"/>
       </w:pPr>
+      <w:rPr/>
     </w:lvl>
     <w:lvl w:ilvl="4">
       <w:start w:val="1"/>
@@ -2774,6 +2630,7 @@
         </w:tabs>
         <w:ind w:start="2160" w:hanging="360"/>
       </w:pPr>
+      <w:rPr/>
     </w:lvl>
     <w:lvl w:ilvl="5">
       <w:start w:val="1"/>
@@ -2786,6 +2643,7 @@
         </w:tabs>
         <w:ind w:start="2520" w:hanging="360"/>
       </w:pPr>
+      <w:rPr/>
     </w:lvl>
     <w:lvl w:ilvl="6">
       <w:start w:val="1"/>
@@ -2798,6 +2656,7 @@
         </w:tabs>
         <w:ind w:start="2880" w:hanging="360"/>
       </w:pPr>
+      <w:rPr/>
     </w:lvl>
     <w:lvl w:ilvl="7">
       <w:start w:val="1"/>
@@ -2810,6 +2669,7 @@
         </w:tabs>
         <w:ind w:start="3240" w:hanging="360"/>
       </w:pPr>
+      <w:rPr/>
     </w:lvl>
     <w:lvl w:ilvl="8">
       <w:start w:val="1"/>
@@ -2822,6 +2682,7 @@
         </w:tabs>
         <w:ind w:start="3600" w:hanging="360"/>
       </w:pPr>
+      <w:rPr/>
     </w:lvl>
   </w:abstractNum>
   <w:abstractNum w:abstractNumId="6">
@@ -2849,6 +2710,7 @@
         </w:tabs>
         <w:ind w:start="1080" w:hanging="360"/>
       </w:pPr>
+      <w:rPr/>
     </w:lvl>
     <w:lvl w:ilvl="2">
       <w:start w:val="1"/>
@@ -2861,6 +2723,7 @@
         </w:tabs>
         <w:ind w:start="1440" w:hanging="360"/>
       </w:pPr>
+      <w:rPr/>
     </w:lvl>
     <w:lvl w:ilvl="3">
       <w:start w:val="1"/>
@@ -2873,6 +2736,7 @@
         </w:tabs>
         <w:ind w:start="1800" w:hanging="360"/>
       </w:pPr>
+      <w:rPr/>
     </w:lvl>
     <w:lvl w:ilvl="4">
       <w:start w:val="1"/>
@@ -2885,6 +2749,7 @@
         </w:tabs>
         <w:ind w:start="2160" w:hanging="360"/>
       </w:pPr>
+      <w:rPr/>
     </w:lvl>
     <w:lvl w:ilvl="5">
       <w:start w:val="1"/>
@@ -2897,6 +2762,7 @@
         </w:tabs>
         <w:ind w:start="2520" w:hanging="360"/>
       </w:pPr>
+      <w:rPr/>
     </w:lvl>
     <w:lvl w:ilvl="6">
       <w:start w:val="1"/>
@@ -2909,6 +2775,7 @@
         </w:tabs>
         <w:ind w:start="2880" w:hanging="360"/>
       </w:pPr>
+      <w:rPr/>
     </w:lvl>
     <w:lvl w:ilvl="7">
       <w:start w:val="1"/>
@@ -2921,6 +2788,7 @@
         </w:tabs>
         <w:ind w:start="3240" w:hanging="360"/>
       </w:pPr>
+      <w:rPr/>
     </w:lvl>
     <w:lvl w:ilvl="8">
       <w:start w:val="1"/>
@@ -2933,6 +2801,7 @@
         </w:tabs>
         <w:ind w:start="3600" w:hanging="360"/>
       </w:pPr>
+      <w:rPr/>
     </w:lvl>
   </w:abstractNum>
   <w:abstractNum w:abstractNumId="7">
@@ -3083,7 +2952,7 @@
   <w:docDefaults>
     <w:rPrDefault>
       <w:rPr>
-        <w:rFonts w:ascii="Cambria" w:hAnsi="Cambria" w:eastAsia="ＭＳ 明朝" w:cs="" w:asciiTheme="minorHAnsi" w:cstheme="minorBidi" w:eastAsiaTheme="minorEastAsia" w:hAnsiTheme="minorHAnsi"/>
+        <w:rFonts w:ascii="Cambria" w:hAnsi="Cambria" w:eastAsia="" w:cs="" w:asciiTheme="minorHAnsi" w:cstheme="minorBidi" w:eastAsiaTheme="minorEastAsia" w:hAnsiTheme="minorHAnsi"/>
         <w:sz w:val="22"/>
         <w:szCs w:val="22"/>
         <w:lang w:val="en-US" w:eastAsia="en-US" w:bidi="ar-SA"/>
@@ -3240,12 +3109,13 @@
     <w:rsid w:val="00fc693f"/>
     <w:pPr>
       <w:widowControl/>
+      <w:suppressAutoHyphens w:val="true"/>
       <w:bidi w:val="0"/>
       <w:spacing w:lineRule="auto" w:line="276" w:before="0" w:after="200"/>
       <w:jc w:val="start"/>
     </w:pPr>
     <w:rPr>
-      <w:rFonts w:ascii="Cambria" w:hAnsi="Cambria" w:eastAsia="ＭＳ 明朝" w:cs="" w:asciiTheme="minorHAnsi" w:cstheme="minorBidi" w:eastAsiaTheme="minorEastAsia" w:hAnsiTheme="minorHAnsi"/>
+      <w:rFonts w:ascii="Cambria" w:hAnsi="Cambria" w:eastAsia="" w:cs="" w:asciiTheme="minorHAnsi" w:cstheme="minorBidi" w:eastAsiaTheme="minorEastAsia" w:hAnsiTheme="minorHAnsi"/>
       <w:color w:val="auto"/>
       <w:kern w:val="0"/>
       <w:sz w:val="22"/>
@@ -3268,7 +3138,7 @@
       <w:outlineLvl w:val="0"/>
     </w:pPr>
     <w:rPr>
-      <w:rFonts w:ascii="Calibri" w:hAnsi="Calibri" w:eastAsia="ＭＳ ゴシック" w:cs="" w:asciiTheme="majorHAnsi" w:cstheme="majorBidi" w:eastAsiaTheme="majorEastAsia" w:hAnsiTheme="majorHAnsi"/>
+      <w:rFonts w:ascii="Calibri" w:hAnsi="Calibri" w:eastAsia="" w:cs="" w:asciiTheme="majorHAnsi" w:cstheme="majorBidi" w:eastAsiaTheme="majorEastAsia" w:hAnsiTheme="majorHAnsi"/>
       <w:b/>
       <w:bCs/>
       <w:color w:themeColor="accent1" w:themeShade="bf" w:val="365F91"/>
@@ -3292,7 +3162,7 @@
       <w:outlineLvl w:val="1"/>
     </w:pPr>
     <w:rPr>
-      <w:rFonts w:ascii="Calibri" w:hAnsi="Calibri" w:eastAsia="ＭＳ ゴシック" w:cs="" w:asciiTheme="majorHAnsi" w:cstheme="majorBidi" w:eastAsiaTheme="majorEastAsia" w:hAnsiTheme="majorHAnsi"/>
+      <w:rFonts w:ascii="Calibri" w:hAnsi="Calibri" w:eastAsia="" w:cs="" w:asciiTheme="majorHAnsi" w:cstheme="majorBidi" w:eastAsiaTheme="majorEastAsia" w:hAnsiTheme="majorHAnsi"/>
       <w:b/>
       <w:bCs/>
       <w:color w:themeColor="accent1" w:val="4F81BD"/>
@@ -3316,7 +3186,7 @@
       <w:outlineLvl w:val="2"/>
     </w:pPr>
     <w:rPr>
-      <w:rFonts w:ascii="Calibri" w:hAnsi="Calibri" w:eastAsia="ＭＳ ゴシック" w:cs="" w:asciiTheme="majorHAnsi" w:cstheme="majorBidi" w:eastAsiaTheme="majorEastAsia" w:hAnsiTheme="majorHAnsi"/>
+      <w:rFonts w:ascii="Calibri" w:hAnsi="Calibri" w:eastAsia="" w:cs="" w:asciiTheme="majorHAnsi" w:cstheme="majorBidi" w:eastAsiaTheme="majorEastAsia" w:hAnsiTheme="majorHAnsi"/>
       <w:b/>
       <w:bCs/>
       <w:color w:themeColor="accent1" w:val="4F81BD"/>
@@ -3339,7 +3209,7 @@
       <w:outlineLvl w:val="3"/>
     </w:pPr>
     <w:rPr>
-      <w:rFonts w:ascii="Calibri" w:hAnsi="Calibri" w:eastAsia="ＭＳ ゴシック" w:cs="" w:asciiTheme="majorHAnsi" w:cstheme="majorBidi" w:eastAsiaTheme="majorEastAsia" w:hAnsiTheme="majorHAnsi"/>
+      <w:rFonts w:ascii="Calibri" w:hAnsi="Calibri" w:eastAsia="" w:cs="" w:asciiTheme="majorHAnsi" w:cstheme="majorBidi" w:eastAsiaTheme="majorEastAsia" w:hAnsiTheme="majorHAnsi"/>
       <w:b/>
       <w:bCs/>
       <w:i/>
@@ -3364,7 +3234,7 @@
       <w:outlineLvl w:val="4"/>
     </w:pPr>
     <w:rPr>
-      <w:rFonts w:ascii="Calibri" w:hAnsi="Calibri" w:eastAsia="ＭＳ ゴシック" w:cs="" w:asciiTheme="majorHAnsi" w:cstheme="majorBidi" w:eastAsiaTheme="majorEastAsia" w:hAnsiTheme="majorHAnsi"/>
+      <w:rFonts w:ascii="Calibri" w:hAnsi="Calibri" w:eastAsia="" w:cs="" w:asciiTheme="majorHAnsi" w:cstheme="majorBidi" w:eastAsiaTheme="majorEastAsia" w:hAnsiTheme="majorHAnsi"/>
       <w:color w:themeColor="accent1" w:themeShade="7f" w:val="243F60"/>
     </w:rPr>
   </w:style>
@@ -3385,7 +3255,7 @@
       <w:outlineLvl w:val="5"/>
     </w:pPr>
     <w:rPr>
-      <w:rFonts w:ascii="Calibri" w:hAnsi="Calibri" w:eastAsia="ＭＳ ゴシック" w:cs="" w:asciiTheme="majorHAnsi" w:cstheme="majorBidi" w:eastAsiaTheme="majorEastAsia" w:hAnsiTheme="majorHAnsi"/>
+      <w:rFonts w:ascii="Calibri" w:hAnsi="Calibri" w:eastAsia="" w:cs="" w:asciiTheme="majorHAnsi" w:cstheme="majorBidi" w:eastAsiaTheme="majorEastAsia" w:hAnsiTheme="majorHAnsi"/>
       <w:i/>
       <w:iCs/>
       <w:color w:themeColor="accent1" w:themeShade="7f" w:val="243F60"/>
@@ -3408,7 +3278,7 @@
       <w:outlineLvl w:val="6"/>
     </w:pPr>
     <w:rPr>
-      <w:rFonts w:ascii="Calibri" w:hAnsi="Calibri" w:eastAsia="ＭＳ ゴシック" w:cs="" w:asciiTheme="majorHAnsi" w:cstheme="majorBidi" w:eastAsiaTheme="majorEastAsia" w:hAnsiTheme="majorHAnsi"/>
+      <w:rFonts w:ascii="Calibri" w:hAnsi="Calibri" w:eastAsia="" w:cs="" w:asciiTheme="majorHAnsi" w:cstheme="majorBidi" w:eastAsiaTheme="majorEastAsia" w:hAnsiTheme="majorHAnsi"/>
       <w:i/>
       <w:iCs/>
       <w:color w:themeColor="text1" w:themeTint="bf" w:val="404040"/>
@@ -3431,7 +3301,7 @@
       <w:outlineLvl w:val="7"/>
     </w:pPr>
     <w:rPr>
-      <w:rFonts w:ascii="Calibri" w:hAnsi="Calibri" w:eastAsia="ＭＳ ゴシック" w:cs="" w:asciiTheme="majorHAnsi" w:cstheme="majorBidi" w:eastAsiaTheme="majorEastAsia" w:hAnsiTheme="majorHAnsi"/>
+      <w:rFonts w:ascii="Calibri" w:hAnsi="Calibri" w:eastAsia="" w:cs="" w:asciiTheme="majorHAnsi" w:cstheme="majorBidi" w:eastAsiaTheme="majorEastAsia" w:hAnsiTheme="majorHAnsi"/>
       <w:color w:themeColor="accent1" w:val="4F81BD"/>
       <w:sz w:val="20"/>
       <w:szCs w:val="20"/>
@@ -3454,7 +3324,7 @@
       <w:outlineLvl w:val="8"/>
     </w:pPr>
     <w:rPr>
-      <w:rFonts w:ascii="Calibri" w:hAnsi="Calibri" w:eastAsia="ＭＳ ゴシック" w:cs="" w:asciiTheme="majorHAnsi" w:cstheme="majorBidi" w:eastAsiaTheme="majorEastAsia" w:hAnsiTheme="majorHAnsi"/>
+      <w:rFonts w:ascii="Calibri" w:hAnsi="Calibri" w:eastAsia="" w:cs="" w:asciiTheme="majorHAnsi" w:cstheme="majorBidi" w:eastAsiaTheme="majorEastAsia" w:hAnsiTheme="majorHAnsi"/>
       <w:i/>
       <w:iCs/>
       <w:color w:themeColor="text1" w:themeTint="bf" w:val="404040"/>
@@ -3496,7 +3366,7 @@
     <w:qFormat/>
     <w:rsid w:val="00fc693f"/>
     <w:rPr>
-      <w:rFonts w:ascii="Calibri" w:hAnsi="Calibri" w:eastAsia="ＭＳ ゴシック" w:cs="" w:asciiTheme="majorHAnsi" w:cstheme="majorBidi" w:eastAsiaTheme="majorEastAsia" w:hAnsiTheme="majorHAnsi"/>
+      <w:rFonts w:ascii="Calibri" w:hAnsi="Calibri" w:eastAsia="" w:cs="" w:asciiTheme="majorHAnsi" w:cstheme="majorBidi" w:eastAsiaTheme="majorEastAsia" w:hAnsiTheme="majorHAnsi"/>
       <w:b/>
       <w:bCs/>
       <w:color w:themeColor="accent1" w:themeShade="bf" w:val="365F91"/>
@@ -3512,7 +3382,7 @@
     <w:qFormat/>
     <w:rsid w:val="00fc693f"/>
     <w:rPr>
-      <w:rFonts w:ascii="Calibri" w:hAnsi="Calibri" w:eastAsia="ＭＳ ゴシック" w:cs="" w:asciiTheme="majorHAnsi" w:cstheme="majorBidi" w:eastAsiaTheme="majorEastAsia" w:hAnsiTheme="majorHAnsi"/>
+      <w:rFonts w:ascii="Calibri" w:hAnsi="Calibri" w:eastAsia="" w:cs="" w:asciiTheme="majorHAnsi" w:cstheme="majorBidi" w:eastAsiaTheme="majorEastAsia" w:hAnsiTheme="majorHAnsi"/>
       <w:b/>
       <w:bCs/>
       <w:color w:themeColor="accent1" w:val="4F81BD"/>
@@ -3528,7 +3398,7 @@
     <w:qFormat/>
     <w:rsid w:val="00fc693f"/>
     <w:rPr>
-      <w:rFonts w:ascii="Calibri" w:hAnsi="Calibri" w:eastAsia="ＭＳ ゴシック" w:cs="" w:asciiTheme="majorHAnsi" w:cstheme="majorBidi" w:eastAsiaTheme="majorEastAsia" w:hAnsiTheme="majorHAnsi"/>
+      <w:rFonts w:ascii="Calibri" w:hAnsi="Calibri" w:eastAsia="" w:cs="" w:asciiTheme="majorHAnsi" w:cstheme="majorBidi" w:eastAsiaTheme="majorEastAsia" w:hAnsiTheme="majorHAnsi"/>
       <w:b/>
       <w:bCs/>
       <w:color w:themeColor="accent1" w:val="4F81BD"/>
@@ -3542,7 +3412,7 @@
     <w:qFormat/>
     <w:rsid w:val="00fc693f"/>
     <w:rPr>
-      <w:rFonts w:ascii="Calibri" w:hAnsi="Calibri" w:eastAsia="ＭＳ ゴシック" w:cs="" w:asciiTheme="majorHAnsi" w:cstheme="majorBidi" w:eastAsiaTheme="majorEastAsia" w:hAnsiTheme="majorHAnsi"/>
+      <w:rFonts w:ascii="Calibri" w:hAnsi="Calibri" w:eastAsia="" w:cs="" w:asciiTheme="majorHAnsi" w:cstheme="majorBidi" w:eastAsiaTheme="majorEastAsia" w:hAnsiTheme="majorHAnsi"/>
       <w:color w:themeColor="text2" w:themeShade="bf" w:val="17365D"/>
       <w:spacing w:val="5"/>
       <w:kern w:val="2"/>
@@ -3558,7 +3428,7 @@
     <w:qFormat/>
     <w:rsid w:val="00fc693f"/>
     <w:rPr>
-      <w:rFonts w:ascii="Calibri" w:hAnsi="Calibri" w:eastAsia="ＭＳ ゴシック" w:cs="" w:asciiTheme="majorHAnsi" w:cstheme="majorBidi" w:eastAsiaTheme="majorEastAsia" w:hAnsiTheme="majorHAnsi"/>
+      <w:rFonts w:ascii="Calibri" w:hAnsi="Calibri" w:eastAsia="" w:cs="" w:asciiTheme="majorHAnsi" w:cstheme="majorBidi" w:eastAsiaTheme="majorEastAsia" w:hAnsiTheme="majorHAnsi"/>
       <w:i/>
       <w:iCs/>
       <w:color w:themeColor="accent1" w:val="4F81BD"/>
@@ -3631,7 +3501,7 @@
     <w:qFormat/>
     <w:rsid w:val="00fc693f"/>
     <w:rPr>
-      <w:rFonts w:ascii="Calibri" w:hAnsi="Calibri" w:eastAsia="ＭＳ ゴシック" w:cs="" w:asciiTheme="majorHAnsi" w:cstheme="majorBidi" w:eastAsiaTheme="majorEastAsia" w:hAnsiTheme="majorHAnsi"/>
+      <w:rFonts w:ascii="Calibri" w:hAnsi="Calibri" w:eastAsia="" w:cs="" w:asciiTheme="majorHAnsi" w:cstheme="majorBidi" w:eastAsiaTheme="majorEastAsia" w:hAnsiTheme="majorHAnsi"/>
       <w:b/>
       <w:bCs/>
       <w:i/>
@@ -3648,7 +3518,7 @@
     <w:qFormat/>
     <w:rsid w:val="00fc693f"/>
     <w:rPr>
-      <w:rFonts w:ascii="Calibri" w:hAnsi="Calibri" w:eastAsia="ＭＳ ゴシック" w:cs="" w:asciiTheme="majorHAnsi" w:cstheme="majorBidi" w:eastAsiaTheme="majorEastAsia" w:hAnsiTheme="majorHAnsi"/>
+      <w:rFonts w:ascii="Calibri" w:hAnsi="Calibri" w:eastAsia="" w:cs="" w:asciiTheme="majorHAnsi" w:cstheme="majorBidi" w:eastAsiaTheme="majorEastAsia" w:hAnsiTheme="majorHAnsi"/>
       <w:color w:themeColor="accent1" w:themeShade="7f" w:val="243F60"/>
     </w:rPr>
   </w:style>
@@ -3661,7 +3531,7 @@
     <w:qFormat/>
     <w:rsid w:val="00fc693f"/>
     <w:rPr>
-      <w:rFonts w:ascii="Calibri" w:hAnsi="Calibri" w:eastAsia="ＭＳ ゴシック" w:cs="" w:asciiTheme="majorHAnsi" w:cstheme="majorBidi" w:eastAsiaTheme="majorEastAsia" w:hAnsiTheme="majorHAnsi"/>
+      <w:rFonts w:ascii="Calibri" w:hAnsi="Calibri" w:eastAsia="" w:cs="" w:asciiTheme="majorHAnsi" w:cstheme="majorBidi" w:eastAsiaTheme="majorEastAsia" w:hAnsiTheme="majorHAnsi"/>
       <w:i/>
       <w:iCs/>
       <w:color w:themeColor="accent1" w:themeShade="7f" w:val="243F60"/>
@@ -3676,7 +3546,7 @@
     <w:qFormat/>
     <w:rsid w:val="00fc693f"/>
     <w:rPr>
-      <w:rFonts w:ascii="Calibri" w:hAnsi="Calibri" w:eastAsia="ＭＳ ゴシック" w:cs="" w:asciiTheme="majorHAnsi" w:cstheme="majorBidi" w:eastAsiaTheme="majorEastAsia" w:hAnsiTheme="majorHAnsi"/>
+      <w:rFonts w:ascii="Calibri" w:hAnsi="Calibri" w:eastAsia="" w:cs="" w:asciiTheme="majorHAnsi" w:cstheme="majorBidi" w:eastAsiaTheme="majorEastAsia" w:hAnsiTheme="majorHAnsi"/>
       <w:i/>
       <w:iCs/>
       <w:color w:themeColor="text1" w:themeTint="bf" w:val="404040"/>
@@ -3691,7 +3561,7 @@
     <w:qFormat/>
     <w:rsid w:val="00fc693f"/>
     <w:rPr>
-      <w:rFonts w:ascii="Calibri" w:hAnsi="Calibri" w:eastAsia="ＭＳ ゴシック" w:cs="" w:asciiTheme="majorHAnsi" w:cstheme="majorBidi" w:eastAsiaTheme="majorEastAsia" w:hAnsiTheme="majorHAnsi"/>
+      <w:rFonts w:ascii="Calibri" w:hAnsi="Calibri" w:eastAsia="" w:cs="" w:asciiTheme="majorHAnsi" w:cstheme="majorBidi" w:eastAsiaTheme="majorEastAsia" w:hAnsiTheme="majorHAnsi"/>
       <w:color w:themeColor="accent1" w:val="4F81BD"/>
       <w:sz w:val="20"/>
       <w:szCs w:val="20"/>
@@ -3706,7 +3576,7 @@
     <w:qFormat/>
     <w:rsid w:val="00fc693f"/>
     <w:rPr>
-      <w:rFonts w:ascii="Calibri" w:hAnsi="Calibri" w:eastAsia="ＭＳ ゴシック" w:cs="" w:asciiTheme="majorHAnsi" w:cstheme="majorBidi" w:eastAsiaTheme="majorEastAsia" w:hAnsiTheme="majorHAnsi"/>
+      <w:rFonts w:ascii="Calibri" w:hAnsi="Calibri" w:eastAsia="" w:cs="" w:asciiTheme="majorHAnsi" w:cstheme="majorBidi" w:eastAsiaTheme="majorEastAsia" w:hAnsiTheme="majorHAnsi"/>
       <w:i/>
       <w:iCs/>
       <w:color w:themeColor="text1" w:themeTint="bf" w:val="404040"/>
@@ -3943,12 +3813,13 @@
     <w:rsid w:val="00fc693f"/>
     <w:pPr>
       <w:widowControl/>
+      <w:suppressAutoHyphens w:val="true"/>
       <w:bidi w:val="0"/>
       <w:spacing w:lineRule="auto" w:line="240" w:before="0" w:after="0"/>
       <w:jc w:val="start"/>
     </w:pPr>
     <w:rPr>
-      <w:rFonts w:ascii="Cambria" w:hAnsi="Cambria" w:eastAsia="ＭＳ 明朝" w:cs="" w:asciiTheme="minorHAnsi" w:cstheme="minorBidi" w:eastAsiaTheme="minorEastAsia" w:hAnsiTheme="minorHAnsi"/>
+      <w:rFonts w:ascii="Cambria" w:hAnsi="Cambria" w:eastAsia="" w:cs="" w:asciiTheme="minorHAnsi" w:cstheme="minorBidi" w:eastAsiaTheme="minorEastAsia" w:hAnsiTheme="minorHAnsi"/>
       <w:color w:val="auto"/>
       <w:kern w:val="0"/>
       <w:sz w:val="22"/>
@@ -3972,7 +3843,7 @@
       <w:contextualSpacing/>
     </w:pPr>
     <w:rPr>
-      <w:rFonts w:ascii="Calibri" w:hAnsi="Calibri" w:eastAsia="ＭＳ ゴシック" w:cs="" w:asciiTheme="majorHAnsi" w:cstheme="majorBidi" w:eastAsiaTheme="majorEastAsia" w:hAnsiTheme="majorHAnsi"/>
+      <w:rFonts w:ascii="Calibri" w:hAnsi="Calibri" w:eastAsia="" w:cs="" w:asciiTheme="majorHAnsi" w:cstheme="majorBidi" w:eastAsiaTheme="majorEastAsia" w:hAnsiTheme="majorHAnsi"/>
       <w:color w:themeColor="text2" w:themeShade="bf" w:val="17365D"/>
       <w:spacing w:val="5"/>
       <w:kern w:val="2"/>
@@ -3990,7 +3861,7 @@
     <w:rsid w:val="00fc693f"/>
     <w:pPr/>
     <w:rPr>
-      <w:rFonts w:ascii="Calibri" w:hAnsi="Calibri" w:eastAsia="ＭＳ ゴシック" w:cs="" w:asciiTheme="majorHAnsi" w:cstheme="majorBidi" w:eastAsiaTheme="majorEastAsia" w:hAnsiTheme="majorHAnsi"/>
+      <w:rFonts w:ascii="Calibri" w:hAnsi="Calibri" w:eastAsia="" w:cs="" w:asciiTheme="majorHAnsi" w:cstheme="majorBidi" w:eastAsiaTheme="majorEastAsia" w:hAnsiTheme="majorHAnsi"/>
       <w:i/>
       <w:iCs/>
       <w:color w:themeColor="accent1" w:val="4F81BD"/>
@@ -4223,12 +4094,13 @@
         <w:tab w:val="left" w:pos="3456" w:leader="none"/>
         <w:tab w:val="left" w:pos="4032" w:leader="none"/>
       </w:tabs>
+      <w:suppressAutoHyphens w:val="true"/>
       <w:bidi w:val="0"/>
       <w:spacing w:lineRule="auto" w:line="276" w:before="0" w:after="200"/>
       <w:jc w:val="start"/>
     </w:pPr>
     <w:rPr>
-      <w:rFonts w:ascii="Courier" w:hAnsi="Courier" w:eastAsia="ＭＳ 明朝" w:cs="" w:cstheme="minorBidi" w:eastAsiaTheme="minorEastAsia"/>
+      <w:rFonts w:ascii="Courier" w:hAnsi="Courier" w:eastAsia="" w:cs="" w:cstheme="minorBidi" w:eastAsiaTheme="minorEastAsia"/>
       <w:color w:val="auto"/>
       <w:kern w:val="0"/>
       <w:sz w:val="20"/>
@@ -7449,7 +7321,6 @@
       <w:pPr>
         <w:spacing w:before="0" w:after="0" w:line="240" w:lineRule="auto"/>
       </w:pPr>
-      <w:rPr/>
       <w:tblPr/>
       <w:tcPr>
         <w:tcBorders>
@@ -7595,7 +7466,6 @@
       <w:pPr>
         <w:spacing w:before="0" w:after="0" w:line="240" w:lineRule="auto"/>
       </w:pPr>
-      <w:rPr/>
       <w:tblPr/>
       <w:tcPr>
         <w:tcBorders>
@@ -7741,7 +7611,6 @@
       <w:pPr>
         <w:spacing w:before="0" w:after="0" w:line="240" w:lineRule="auto"/>
       </w:pPr>
-      <w:rPr/>
       <w:tblPr/>
       <w:tcPr>
         <w:tcBorders>
@@ -7887,7 +7756,6 @@
       <w:pPr>
         <w:spacing w:before="0" w:after="0" w:line="240" w:lineRule="auto"/>
       </w:pPr>
-      <w:rPr/>
       <w:tblPr/>
       <w:tcPr>
         <w:tcBorders>
@@ -8033,7 +7901,6 @@
       <w:pPr>
         <w:spacing w:before="0" w:after="0" w:line="240" w:lineRule="auto"/>
       </w:pPr>
-      <w:rPr/>
       <w:tblPr/>
       <w:tcPr>
         <w:tcBorders>
@@ -8179,7 +8046,6 @@
       <w:pPr>
         <w:spacing w:before="0" w:after="0" w:line="240" w:lineRule="auto"/>
       </w:pPr>
-      <w:rPr/>
       <w:tblPr/>
       <w:tcPr>
         <w:tcBorders>
@@ -8325,7 +8191,6 @@
       <w:pPr>
         <w:spacing w:before="0" w:after="0" w:line="240" w:lineRule="auto"/>
       </w:pPr>
-      <w:rPr/>
       <w:tblPr/>
       <w:tcPr>
         <w:tcBorders>

</xml_diff>